<commit_message>
Add risk-of-bias workbook, R analysis script with tests, spreadsheet checks
- tools/build_rob_workbook.py and the RoB template (protocol Section 15 items,
  derived adequacy column for sensitivity analysis 5); compare_extractions.py
  now also compares two RoB files.
- tools/analysis_ipd.R: registered analysis (protocol Sections 12, 16-18) with a
  run log carrying SHA-256 hashes; assumptions listed in a separate note.
- tools/test_analysis_ipd.py: synthetic-data tests cross-checked against
  statsmodels/scipy and hand formulas; deliberate-breakage check done.
- Tests that open both workbooks in LibreOffice Calc and compare derived columns
  and drop-downs; README statements about verification corrected.
- Merge of the old session branch (12 Oct screening export analysis); HANDOFF
  corrected; Methods draft marks the AI statement as pending.

Co-Authored-By: Claude Sonnet 5.5 <noreply@anthropic.com>
Claude-Session: https://claude.ai/code/session_017BKkAkTLfidWPZV4f6Xm8t
</commit_message>
<xml_diff>
--- a/Methods draft and PRISMA-S appendix (draft).docx
+++ b/Methods draft and PRISMA-S appendix (draft).docx
@@ -22,7 +22,7 @@
         <w:rPr>
           <w:rFonts w:ascii="Calibri" w:cs="Calibri" w:eastAsia="Microsoft YaHei" w:hAnsi="Calibri"/>
         </w:rPr>
-        <w:t xml:space="preserve">版本 v2026-10-11b。</w:t>
+        <w:t xml:space="preserve">版本 v2026-10-14a（2026-10-11 的 v2026-10-11b 加了第 1 节第 6 条和一处待确认标记）。</w:t>
       </w:r>
       <w:r>
         <w:rPr>
@@ -262,37 +262,26 @@
     </w:p>
     <w:p>
       <w:pPr>
-        <w:pStyle w:val="Heading2"/>
-        <w:keepNext/>
-      </w:pPr>
-      <w:r>
-        <w:rPr>
-          <w:rFonts w:ascii="Calibri" w:cs="Calibri" w:eastAsia="Microsoft YaHei" w:hAnsi="Calibri"/>
-        </w:rPr>
-        <w:t xml:space="preserve">2. Methods（英文，论文用）</w:t>
-      </w:r>
-    </w:p>
-    <w:p>
-      <w:pPr>
-        <w:pStyle w:val="Heading3"/>
-        <w:keepNext/>
-      </w:pPr>
-      <w:r>
-        <w:rPr>
-          <w:rFonts w:ascii="Calibri" w:cs="Calibri" w:eastAsia="Microsoft YaHei" w:hAnsi="Calibri"/>
-        </w:rPr>
-        <w:t xml:space="preserve">Study design and registration</w:t>
-      </w:r>
-    </w:p>
-    <w:p>
-      <w:pPr>
-        <w:spacing w:after="120"/>
-      </w:pPr>
-      <w:r>
-        <w:rPr>
-          <w:rFonts w:ascii="Calibri" w:cs="Calibri" w:eastAsia="Microsoft YaHei" w:hAnsi="Calibri"/>
-        </w:rPr>
-        <w:t xml:space="preserve">We carried out a systematic review of individual patient data (IPD) extracted from published reports of wandering spleen in children, pooled with a single-centre case series. The review was registered in PROSPERO (CRD420261520329) on 28 September 2026. The protocol was revised four times after registration; none of the revisions changed the eligibility criteria, exposures, outcomes or analysis plan: version 1.1 (28 September 2026) revised the search strategies after review by a medical librarian; version 1.2 (4 October 2026) added the as-run details of the searches and of deduplication; version 1.3 (7 October 2026) added the screening procedure as set up; and version 1.4 (11 October 2026) corrected the stage of review recorded at that time, because formal screening had already started. </w:t>
+        <w:pStyle w:val="ListParagraph"/>
+        <w:numPr>
+          <w:ilvl w:val="0"/>
+          <w:numId w:val="2"/>
+        </w:numPr>
+        <w:spacing w:after="60"/>
+      </w:pPr>
+      <w:r>
+        <w:rPr>
+          <w:rFonts w:ascii="Calibri" w:cs="Calibri" w:eastAsia="Microsoft YaHei" w:hAnsi="Calibri"/>
+          <w:b/>
+          <w:bCs/>
+        </w:rPr>
+        <w:t xml:space="preserve">（2026-10-14 补）标题摘要阶段已有导出结果（旧会话 10 月 12 日分析），但先不要把数字填进上面的 [PENDING]：</w:t>
+      </w:r>
+      <w:r>
+        <w:rPr>
+          <w:rFonts w:ascii="Calibri" w:cs="Calibri" w:eastAsia="Microsoft YaHei" w:hAnsi="Calibri"/>
+        </w:rPr>
+        <w:t xml:space="preserve"> 两位评审员的一致性只有 69.7%（kappa 0.48），642 条"一方推进、一方排除"的冲突；第二位评审员账号的决定速度、批量操作和 </w:t>
       </w:r>
       <w:r>
         <w:rPr>
@@ -301,13 +290,48 @@
           <w:szCs w:val="19"/>
           <w:shd w:fill="EEEEEE" w:val="clear"/>
         </w:rPr>
-        <w:t xml:space="preserve">[PENDING: the v1.4 amendment has not yet been submitted to PROSPERO; update this sentence with the date it is submitted and the final version number.]</w:t>
-      </w:r>
-      <w:r>
-        <w:rPr>
-          <w:rFonts w:ascii="Calibri" w:cs="Calibri" w:eastAsia="Microsoft YaHei" w:hAnsi="Calibri"/>
-        </w:rPr>
-        <w:t xml:space="preserve"> The review is reported according to PRISMA 2020 [3], PRISMA-IPD [4] and, for the searches, PRISMA-S [13]; the checklists are provided as supplementary files </w:t>
+        <w:t xml:space="preserve">AI-prescreen</w:t>
+      </w:r>
+      <w:r>
+        <w:rPr>
+          <w:rFonts w:ascii="Calibri" w:cs="Calibri" w:eastAsia="Microsoft YaHei" w:hAnsi="Calibri"/>
+        </w:rPr>
+        <w:t xml:space="preserve"> 标签还在等 Fei Peng 的解释，如何处理（重新独立筛选、第三人盲审冲突、或原样裁决）尚未决定。这些事实和最终选择都要写进 Methods 和局限，所以先等决定。另外，上面"Rayyan 的 AI 功能未使用"一句已标为待确认。</w:t>
+      </w:r>
+    </w:p>
+    <w:p>
+      <w:pPr>
+        <w:pStyle w:val="Heading2"/>
+        <w:keepNext/>
+      </w:pPr>
+      <w:r>
+        <w:rPr>
+          <w:rFonts w:ascii="Calibri" w:cs="Calibri" w:eastAsia="Microsoft YaHei" w:hAnsi="Calibri"/>
+        </w:rPr>
+        <w:t xml:space="preserve">2. Methods（英文，论文用）</w:t>
+      </w:r>
+    </w:p>
+    <w:p>
+      <w:pPr>
+        <w:pStyle w:val="Heading3"/>
+        <w:keepNext/>
+      </w:pPr>
+      <w:r>
+        <w:rPr>
+          <w:rFonts w:ascii="Calibri" w:cs="Calibri" w:eastAsia="Microsoft YaHei" w:hAnsi="Calibri"/>
+        </w:rPr>
+        <w:t xml:space="preserve">Study design and registration</w:t>
+      </w:r>
+    </w:p>
+    <w:p>
+      <w:pPr>
+        <w:spacing w:after="120"/>
+      </w:pPr>
+      <w:r>
+        <w:rPr>
+          <w:rFonts w:ascii="Calibri" w:cs="Calibri" w:eastAsia="Microsoft YaHei" w:hAnsi="Calibri"/>
+        </w:rPr>
+        <w:t xml:space="preserve">We carried out a systematic review of individual patient data (IPD) extracted from published reports of wandering spleen in children, pooled with a single-centre case series. The review was registered in PROSPERO (CRD420261520329) on 28 September 2026. The protocol was revised four times after registration; none of the revisions changed the eligibility criteria, exposures, outcomes or analysis plan: version 1.1 (28 September 2026) revised the search strategies after review by a medical librarian; version 1.2 (4 October 2026) added the as-run details of the searches and of deduplication; version 1.3 (7 October 2026) added the screening procedure as set up; and version 1.4 (11 October 2026) corrected the stage of review recorded at that time, because formal screening had already started. </w:t>
       </w:r>
       <w:r>
         <w:rPr>
@@ -316,47 +340,13 @@
           <w:szCs w:val="19"/>
           <w:shd w:fill="EEEEEE" w:val="clear"/>
         </w:rPr>
-        <w:t xml:space="preserve">[PENDING]</w:t>
-      </w:r>
-      <w:r>
-        <w:rPr>
-          <w:rFonts w:ascii="Calibri" w:cs="Calibri" w:eastAsia="Microsoft YaHei" w:hAnsi="Calibri"/>
-        </w:rPr>
-        <w:t xml:space="preserve">.</w:t>
-      </w:r>
-    </w:p>
-    <w:p>
-      <w:pPr>
-        <w:spacing w:after="120"/>
-      </w:pPr>
-      <w:r>
-        <w:rPr>
-          <w:rFonts w:ascii="Calibri" w:cs="Calibri" w:eastAsia="Microsoft YaHei" w:hAnsi="Calibri"/>
-        </w:rPr>
-        <w:t xml:space="preserve">The research question was set in the registered protocol, before screening and data extraction began: in children younger than 18 years who undergo surgery for wandering spleen, is a longer duration of the index symptomatic episode before operation associated with a non-viable spleen at operation? Before the protocol was written, we extracted data from 53 reports collected by hand (a pilot, not a systematic search). The pilot informed the choice of the primary exposure and is declared in the registration.</w:t>
-      </w:r>
-    </w:p>
-    <w:p>
-      <w:pPr>
-        <w:pStyle w:val="Heading3"/>
-        <w:keepNext/>
-      </w:pPr>
-      <w:r>
-        <w:rPr>
-          <w:rFonts w:ascii="Calibri" w:cs="Calibri" w:eastAsia="Microsoft YaHei" w:hAnsi="Calibri"/>
-        </w:rPr>
-        <w:t xml:space="preserve">Own case series</w:t>
-      </w:r>
-    </w:p>
-    <w:p>
-      <w:pPr>
-        <w:spacing w:after="120"/>
-      </w:pPr>
-      <w:r>
-        <w:rPr>
-          <w:rFonts w:ascii="Calibri" w:cs="Calibri" w:eastAsia="Microsoft YaHei" w:hAnsi="Calibri"/>
-        </w:rPr>
-        <w:t xml:space="preserve">The case series comprises five children treated for wandering spleen at Wuhan Children's Hospital (Wuhan Maternal and Child Healthcare Hospital), Tongji Medical College, Huazhong University of Science and Technology, China. The study was approved by the hospital's ethics committee (registration number 2025R156-E01), with supplementary approval covering the fifth patient </w:t>
+        <w:t xml:space="preserve">[PENDING: the v1.4 amendment has not yet been submitted to PROSPERO; update this sentence with the date it is submitted and the final version number.]</w:t>
+      </w:r>
+      <w:r>
+        <w:rPr>
+          <w:rFonts w:ascii="Calibri" w:cs="Calibri" w:eastAsia="Microsoft YaHei" w:hAnsi="Calibri"/>
+        </w:rPr>
+        <w:t xml:space="preserve"> The review is reported according to PRISMA 2020 [3], PRISMA-IPD [4] and, for the searches, PRISMA-S [13]; the checklists are provided as supplementary files </w:t>
       </w:r>
       <w:r>
         <w:rPr>
@@ -365,13 +355,47 @@
           <w:szCs w:val="19"/>
           <w:shd w:fill="EEEEEE" w:val="clear"/>
         </w:rPr>
-        <w:t xml:space="preserve">[PENDING: confirm whether the supplementary approval has its own number]</w:t>
-      </w:r>
-      <w:r>
-        <w:rPr>
-          <w:rFonts w:ascii="Calibri" w:cs="Calibri" w:eastAsia="Microsoft YaHei" w:hAnsi="Calibri"/>
-        </w:rPr>
-        <w:t xml:space="preserve">. </w:t>
+        <w:t xml:space="preserve">[PENDING]</w:t>
+      </w:r>
+      <w:r>
+        <w:rPr>
+          <w:rFonts w:ascii="Calibri" w:cs="Calibri" w:eastAsia="Microsoft YaHei" w:hAnsi="Calibri"/>
+        </w:rPr>
+        <w:t xml:space="preserve">.</w:t>
+      </w:r>
+    </w:p>
+    <w:p>
+      <w:pPr>
+        <w:spacing w:after="120"/>
+      </w:pPr>
+      <w:r>
+        <w:rPr>
+          <w:rFonts w:ascii="Calibri" w:cs="Calibri" w:eastAsia="Microsoft YaHei" w:hAnsi="Calibri"/>
+        </w:rPr>
+        <w:t xml:space="preserve">The research question was set in the registered protocol, before screening and data extraction began: in children younger than 18 years who undergo surgery for wandering spleen, is a longer duration of the index symptomatic episode before operation associated with a non-viable spleen at operation? Before the protocol was written, we extracted data from 53 reports collected by hand (a pilot, not a systematic search). The pilot informed the choice of the primary exposure and is declared in the registration.</w:t>
+      </w:r>
+    </w:p>
+    <w:p>
+      <w:pPr>
+        <w:pStyle w:val="Heading3"/>
+        <w:keepNext/>
+      </w:pPr>
+      <w:r>
+        <w:rPr>
+          <w:rFonts w:ascii="Calibri" w:cs="Calibri" w:eastAsia="Microsoft YaHei" w:hAnsi="Calibri"/>
+        </w:rPr>
+        <w:t xml:space="preserve">Own case series</w:t>
+      </w:r>
+    </w:p>
+    <w:p>
+      <w:pPr>
+        <w:spacing w:after="120"/>
+      </w:pPr>
+      <w:r>
+        <w:rPr>
+          <w:rFonts w:ascii="Calibri" w:cs="Calibri" w:eastAsia="Microsoft YaHei" w:hAnsi="Calibri"/>
+        </w:rPr>
+        <w:t xml:space="preserve">The case series comprises five children treated for wandering spleen at Wuhan Children's Hospital (Wuhan Maternal and Child Healthcare Hospital), Tongji Medical College, Huazhong University of Science and Technology, China. The study was approved by the hospital's ethics committee (registration number 2025R156-E01), with supplementary approval covering the fifth patient </w:t>
       </w:r>
       <w:r>
         <w:rPr>
@@ -380,70 +404,13 @@
           <w:szCs w:val="19"/>
           <w:shd w:fill="EEEEEE" w:val="clear"/>
         </w:rPr>
-        <w:t xml:space="preserve">[PENDING: state that written informed consent for publication of clinical details and images was obtained from the parents of all five children — not recorded in the project notes; confirm before writing this sentence.]</w:t>
-      </w:r>
-      <w:r>
-        <w:rPr>
-          <w:rFonts w:ascii="Calibri" w:cs="Calibri" w:eastAsia="Microsoft YaHei" w:hAnsi="Calibri"/>
-        </w:rPr>
-        <w:t xml:space="preserve"> These five children were extracted with the same form as the published patients and analysed together with them; a sensitivity analysis excludes them.</w:t>
-      </w:r>
-    </w:p>
-    <w:p>
-      <w:pPr>
-        <w:pStyle w:val="Heading3"/>
-        <w:keepNext/>
-      </w:pPr>
-      <w:r>
-        <w:rPr>
-          <w:rFonts w:ascii="Calibri" w:cs="Calibri" w:eastAsia="Microsoft YaHei" w:hAnsi="Calibri"/>
-        </w:rPr>
-        <w:t xml:space="preserve">Eligibility criteria</w:t>
-      </w:r>
-    </w:p>
-    <w:p>
-      <w:pPr>
-        <w:spacing w:after="120"/>
-      </w:pPr>
-      <w:r>
-        <w:rPr>
-          <w:rFonts w:ascii="Calibri" w:cs="Calibri" w:eastAsia="Microsoft YaHei" w:hAnsi="Calibri"/>
-        </w:rPr>
-        <w:t xml:space="preserve">Eligible patients were younger than 18 years at operation (or at diagnosis, for children managed without operation), with a wandering spleen confirmed by imaging and/or at operation. We defined a wandering spleen as an abnormally mobile spleen displaced from the left upper quadrant because of absent or lax suspensory ligaments, with or without torsion of the vascular pedicle. Congenital and acquired forms (for example after fundoplication or nephrectomy) were both eligible, and acquired cases form a subgroup. Individual data on age and, for the primary analysis, on splenic viability at operation had to be reported, or be supplied by the authors. We excluded torsion of an accessory spleen (including a wandering accessory spleen), torsion of an orthotopic spleen without ectopia, splenosis, and patients whose age was not reported individually and could not be established as younger than 18 years. Children managed without operation were summarised descriptively; they have no operative outcome and did not enter the primary analysis.</w:t>
-      </w:r>
-    </w:p>
-    <w:p>
-      <w:pPr>
-        <w:spacing w:after="120"/>
-      </w:pPr>
-      <w:r>
-        <w:rPr>
-          <w:rFonts w:ascii="Calibri" w:cs="Calibri" w:eastAsia="Microsoft YaHei" w:hAnsi="Calibri"/>
-        </w:rPr>
-        <w:t xml:space="preserve">Eligible reports were case reports, case series, cohort studies, letters and reviews that describe original patients, provided that individual patient data were reported or supplied. Reviews without new patients (used only for checking reference lists), conference abstracts and editorials without patient data were excluded. Reports with full text in English or Chinese were extracted; reports in other languages were listed and counted but not extracted. Any clinical setting in any country was eligible.</w:t>
-      </w:r>
-    </w:p>
-    <w:p>
-      <w:pPr>
-        <w:pStyle w:val="Heading3"/>
-        <w:keepNext/>
-      </w:pPr>
-      <w:r>
-        <w:rPr>
-          <w:rFonts w:ascii="Calibri" w:cs="Calibri" w:eastAsia="Microsoft YaHei" w:hAnsi="Calibri"/>
-        </w:rPr>
-        <w:t xml:space="preserve">Information sources and search</w:t>
-      </w:r>
-    </w:p>
-    <w:p>
-      <w:pPr>
-        <w:spacing w:after="120"/>
-      </w:pPr>
-      <w:r>
-        <w:rPr>
-          <w:rFonts w:ascii="Calibri" w:cs="Calibri" w:eastAsia="Microsoft YaHei" w:hAnsi="Calibri"/>
-        </w:rPr>
-        <w:t xml:space="preserve">We searched MEDLINE (via PubMed), Web of Science Core Collection, Scopus, China National Knowledge Infrastructure (CNKI), Wanfang Data and the China Biology Medicine database (CBM, via SinoMed). The searches combined controlled vocabulary, where it exists, with free-text synonyms for wandering spleen, splenic torsion and splenopexy, and had no language, date, age or study-design limits. A medical librarian reviewed the strategies before the formal searches, and the PubMed strategy was test-run on 28 September 2026; the review led to the replacement of eight phrases that are not in the PubMed phrase index by proximity searches, to additional synonyms, and to harmonised term lists across databases. The searches were run by one author (JS) between 28 and 29 September 2026 and returned 4,906 records: 1,263 from PubMed, 750 from Web of Science, 1,563 from Scopus, 486 from CNKI, 423 from Wanfang and 421 from CBM. For every database, the number of records exported equalled the number of hits. The full strategies as run, the platforms, the dates and the limits are given in Supplementary Appendix A (summarised in Table S1 below). Coverage in Web of Science is limited by the institutional licence (eight indexes, each from the year of its start; Table S1), so it does not extend to the inception of the database. </w:t>
+        <w:t xml:space="preserve">[PENDING: confirm whether the supplementary approval has its own number]</w:t>
+      </w:r>
+      <w:r>
+        <w:rPr>
+          <w:rFonts w:ascii="Calibri" w:cs="Calibri" w:eastAsia="Microsoft YaHei" w:hAnsi="Calibri"/>
+        </w:rPr>
+        <w:t xml:space="preserve">. </w:t>
       </w:r>
       <w:r>
         <w:rPr>
@@ -452,7 +419,13 @@
           <w:szCs w:val="19"/>
           <w:shd w:fill="EEEEEE" w:val="clear"/>
         </w:rPr>
-        <w:t xml:space="preserve">[PENDING: the update search — see Updates below.]</w:t>
+        <w:t xml:space="preserve">[PENDING: state that written informed consent for publication of clinical details and images was obtained from the parents of all five children — not recorded in the project notes; confirm before writing this sentence.]</w:t>
+      </w:r>
+      <w:r>
+        <w:rPr>
+          <w:rFonts w:ascii="Calibri" w:cs="Calibri" w:eastAsia="Microsoft YaHei" w:hAnsi="Calibri"/>
+        </w:rPr>
+        <w:t xml:space="preserve"> These five children were extracted with the same form as the published patients and analysed together with them; a sensitivity analysis excludes them.</w:t>
       </w:r>
     </w:p>
     <w:p>
@@ -464,7 +437,7 @@
         <w:rPr>
           <w:rFonts w:ascii="Calibri" w:cs="Calibri" w:eastAsia="Microsoft YaHei" w:hAnsi="Calibri"/>
         </w:rPr>
-        <w:t xml:space="preserve">Deviations from the protocol in the search</w:t>
+        <w:t xml:space="preserve">Eligibility criteria</w:t>
       </w:r>
     </w:p>
     <w:p>
@@ -475,7 +448,41 @@
         <w:rPr>
           <w:rFonts w:ascii="Calibri" w:cs="Calibri" w:eastAsia="Microsoft YaHei" w:hAnsi="Calibri"/>
         </w:rPr>
-        <w:t xml:space="preserve">Three planned sources were not completed. First, Embase (Embase.com) was not searched: the Emtree terms were checked on 29 September 2026, but on 4 October 2026 institutional access was no longer recognised and could not be restored, so no Embase records were retrieved. Second, Google Scholar was not searched: on 4 October 2026 Google returned its unusual-traffic block page and no results were seen. Third, citation searching was not completed: the cited-by lists of Ganarin et al. [1] in Web of Science and in Scopus (13 documents each) were viewed on 4 October 2026 but not exported or screened; backward searching of the reference lists of earlier reviews and larger series [1, 5–12] was not done; and backward searching of the included reports depends on the final included set </w:t>
+        <w:t xml:space="preserve">Eligible patients were younger than 18 years at operation (or at diagnosis, for children managed without operation), with a wandering spleen confirmed by imaging and/or at operation. We defined a wandering spleen as an abnormally mobile spleen displaced from the left upper quadrant because of absent or lax suspensory ligaments, with or without torsion of the vascular pedicle. Congenital and acquired forms (for example after fundoplication or nephrectomy) were both eligible, and acquired cases form a subgroup. Individual data on age and, for the primary analysis, on splenic viability at operation had to be reported, or be supplied by the authors. We excluded torsion of an accessory spleen (including a wandering accessory spleen), torsion of an orthotopic spleen without ectopia, splenosis, and patients whose age was not reported individually and could not be established as younger than 18 years. Children managed without operation were summarised descriptively; they have no operative outcome and did not enter the primary analysis.</w:t>
+      </w:r>
+    </w:p>
+    <w:p>
+      <w:pPr>
+        <w:spacing w:after="120"/>
+      </w:pPr>
+      <w:r>
+        <w:rPr>
+          <w:rFonts w:ascii="Calibri" w:cs="Calibri" w:eastAsia="Microsoft YaHei" w:hAnsi="Calibri"/>
+        </w:rPr>
+        <w:t xml:space="preserve">Eligible reports were case reports, case series, cohort studies, letters and reviews that describe original patients, provided that individual patient data were reported or supplied. Reviews without new patients (used only for checking reference lists), conference abstracts and editorials without patient data were excluded. Reports with full text in English or Chinese were extracted; reports in other languages were listed and counted but not extracted. Any clinical setting in any country was eligible.</w:t>
+      </w:r>
+    </w:p>
+    <w:p>
+      <w:pPr>
+        <w:pStyle w:val="Heading3"/>
+        <w:keepNext/>
+      </w:pPr>
+      <w:r>
+        <w:rPr>
+          <w:rFonts w:ascii="Calibri" w:cs="Calibri" w:eastAsia="Microsoft YaHei" w:hAnsi="Calibri"/>
+        </w:rPr>
+        <w:t xml:space="preserve">Information sources and search</w:t>
+      </w:r>
+    </w:p>
+    <w:p>
+      <w:pPr>
+        <w:spacing w:after="120"/>
+      </w:pPr>
+      <w:r>
+        <w:rPr>
+          <w:rFonts w:ascii="Calibri" w:cs="Calibri" w:eastAsia="Microsoft YaHei" w:hAnsi="Calibri"/>
+        </w:rPr>
+        <w:t xml:space="preserve">We searched MEDLINE (via PubMed), Web of Science Core Collection, Scopus, China National Knowledge Infrastructure (CNKI), Wanfang Data and the China Biology Medicine database (CBM, via SinoMed). The searches combined controlled vocabulary, where it exists, with free-text synonyms for wandering spleen, splenic torsion and splenopexy, and had no language, date, age or study-design limits. A medical librarian reviewed the strategies before the formal searches, and the PubMed strategy was test-run on 28 September 2026; the review led to the replacement of eight phrases that are not in the PubMed phrase index by proximity searches, to additional synonyms, and to harmonised term lists across databases. The searches were run by one author (JS) between 28 and 29 September 2026 and returned 4,906 records: 1,263 from PubMed, 750 from Web of Science, 1,563 from Scopus, 486 from CNKI, 423 from Wanfang and 421 from CBM. For every database, the number of records exported equalled the number of hits. The full strategies as run, the platforms, the dates and the limits are given in Supplementary Appendix A (summarised in Table S1 below). Coverage in Web of Science is limited by the institutional licence (eight indexes, each from the year of its start; Table S1), so it does not extend to the inception of the database. </w:t>
       </w:r>
       <w:r>
         <w:rPr>
@@ -484,13 +491,30 @@
           <w:szCs w:val="19"/>
           <w:shd w:fill="EEEEEE" w:val="clear"/>
         </w:rPr>
-        <w:t xml:space="preserve">[PENDING: state whether it was done]</w:t>
-      </w:r>
-      <w:r>
-        <w:rPr>
-          <w:rFonts w:ascii="Calibri" w:cs="Calibri" w:eastAsia="Microsoft YaHei" w:hAnsi="Calibri"/>
-        </w:rPr>
-        <w:t xml:space="preserve">. No record from these sources entered the screening set. We discuss the consequences in the Limitations. These deviations were reported in the PROSPERO record </w:t>
+        <w:t xml:space="preserve">[PENDING: the update search — see Updates below.]</w:t>
+      </w:r>
+    </w:p>
+    <w:p>
+      <w:pPr>
+        <w:pStyle w:val="Heading3"/>
+        <w:keepNext/>
+      </w:pPr>
+      <w:r>
+        <w:rPr>
+          <w:rFonts w:ascii="Calibri" w:cs="Calibri" w:eastAsia="Microsoft YaHei" w:hAnsi="Calibri"/>
+        </w:rPr>
+        <w:t xml:space="preserve">Deviations from the protocol in the search</w:t>
+      </w:r>
+    </w:p>
+    <w:p>
+      <w:pPr>
+        <w:spacing w:after="120"/>
+      </w:pPr>
+      <w:r>
+        <w:rPr>
+          <w:rFonts w:ascii="Calibri" w:cs="Calibri" w:eastAsia="Microsoft YaHei" w:hAnsi="Calibri"/>
+        </w:rPr>
+        <w:t xml:space="preserve">Three planned sources were not completed. First, Embase (Embase.com) was not searched: the Emtree terms were checked on 29 September 2026, but on 4 October 2026 institutional access was no longer recognised and could not be restored, so no Embase records were retrieved. Second, Google Scholar was not searched: on 4 October 2026 Google returned its unusual-traffic block page and no results were seen. Third, citation searching was not completed: the cited-by lists of Ganarin et al. [1] in Web of Science and in Scopus (13 documents each) were viewed on 4 October 2026 but not exported or screened; backward searching of the reference lists of earlier reviews and larger series [1, 5–12] was not done; and backward searching of the included reports depends on the final included set </w:t>
       </w:r>
       <w:r>
         <w:rPr>
@@ -499,36 +523,13 @@
           <w:szCs w:val="19"/>
           <w:shd w:fill="EEEEEE" w:val="clear"/>
         </w:rPr>
-        <w:t xml:space="preserve">[PENDING: after the v1.4 amendment is submitted]</w:t>
-      </w:r>
-      <w:r>
-        <w:rPr>
-          <w:rFonts w:ascii="Calibri" w:cs="Calibri" w:eastAsia="Microsoft YaHei" w:hAnsi="Calibri"/>
-        </w:rPr>
-        <w:t xml:space="preserve">.</w:t>
-      </w:r>
-    </w:p>
-    <w:p>
-      <w:pPr>
-        <w:pStyle w:val="Heading3"/>
-        <w:keepNext/>
-      </w:pPr>
-      <w:r>
-        <w:rPr>
-          <w:rFonts w:ascii="Calibri" w:cs="Calibri" w:eastAsia="Microsoft YaHei" w:hAnsi="Calibri"/>
-        </w:rPr>
-        <w:t xml:space="preserve">Deduplication</w:t>
-      </w:r>
-    </w:p>
-    <w:p>
-      <w:pPr>
-        <w:spacing w:after="120"/>
-      </w:pPr>
-      <w:r>
-        <w:rPr>
-          <w:rFonts w:ascii="Calibri" w:cs="Calibri" w:eastAsia="Microsoft YaHei" w:hAnsi="Calibri"/>
-        </w:rPr>
-        <w:t xml:space="preserve">Records were deduplicated with a documented rule-based script (in order: identical DOI; identical title with the same first author and year; the same title written in another script; similar title with the same first author and year; the same first author, year, volume and first page; the same title, volume and pages; Chinese title with the same year, journal and pages; and the same title, year, journal and volume), and by two manual merges decided after reading the remaining pairs with identical titles (52 such pairs were reviewed and kept apart, being different publications, patents or animal studies). In total 2,358 duplicates were removed (1,293 by DOI, 880 by title, first author and year, and 185 by the remaining rules and the two manual merges), leaving 2,548 records to screen. As a check, EndNote's duplicate finder (default criteria) was run on an intermediate version of 2,550 records; it flagged 32 records, all of them in groups of distinct publications by the same authors or unrelated patents. A looser check by script (identical title and year) found two further duplicates that differed only in the way the authors' names were written; they were merged by the last rule. Two possible duplicate publications of the same patient (one pair of Chinese-language reports and one pair of German-language reports) are to be checked at full text. The script and its output are in the project repository </w:t>
+        <w:t xml:space="preserve">[PENDING: state whether it was done]</w:t>
+      </w:r>
+      <w:r>
+        <w:rPr>
+          <w:rFonts w:ascii="Calibri" w:cs="Calibri" w:eastAsia="Microsoft YaHei" w:hAnsi="Calibri"/>
+        </w:rPr>
+        <w:t xml:space="preserve">. No record from these sources entered the screening set. We discuss the consequences in the Limitations. These deviations were reported in the PROSPERO record </w:t>
       </w:r>
       <w:r>
         <w:rPr>
@@ -537,7 +538,7 @@
           <w:szCs w:val="19"/>
           <w:shd w:fill="EEEEEE" w:val="clear"/>
         </w:rPr>
-        <w:t xml:space="preserve">[PENDING: give the repository or archive address that will be public]</w:t>
+        <w:t xml:space="preserve">[PENDING: after the v1.4 amendment is submitted]</w:t>
       </w:r>
       <w:r>
         <w:rPr>
@@ -555,7 +556,7 @@
         <w:rPr>
           <w:rFonts w:ascii="Calibri" w:cs="Calibri" w:eastAsia="Microsoft YaHei" w:hAnsi="Calibri"/>
         </w:rPr>
-        <w:t xml:space="preserve">Selection of reports</w:t>
+        <w:t xml:space="preserve">Deduplication</w:t>
       </w:r>
     </w:p>
     <w:p>
@@ -566,7 +567,60 @@
         <w:rPr>
           <w:rFonts w:ascii="Calibri" w:cs="Calibri" w:eastAsia="Microsoft YaHei" w:hAnsi="Calibri"/>
         </w:rPr>
-        <w:t xml:space="preserve">Titles and abstracts were screened in Rayyan by two reviewers independently (JS and FP), with Rayyan's blind mode on until both had finished the stage, author and journal details hidden, and Rayyan's artificial-intelligence functions, automatic duplicate detection and automatic duplicate resolution not used. Before formal screening, both reviewers screened a random calibration set of 50 of the 2,548 records (random seed 20261004) and discussed the discrepancies: they agreed on 45 of 50 records (90.0%; Cohen's kappa 0.83), and all five disagreements were among the 11 records without an abstract. In the calibration, author and journal details were visible to both reviewers during part of the exercise. A written screening guide, revised after the calibration, applied the eligibility criteria without changing them; its main rules were that Maybe was chosen when in doubt, that every exclusion at this stage carried one of six reasons (not human; not wandering spleen; adults only; no original patient data; not a formal article; other), and that records without an abstract were judged on the title alone. Where one reviewer excluded a record and the other included it or marked it Maybe, the reviewers discussed it and, failing agreement, a third author (JY) decided. Records marked Include or Maybe by either reviewer, and not excluded after discussion, went to full-text assessment.</w:t>
+        <w:t xml:space="preserve">Records were deduplicated with a documented rule-based script (in order: identical DOI; identical title with the same first author and year; the same title written in another script; similar title with the same first author and year; the same first author, year, volume and first page; the same title, volume and pages; Chinese title with the same year, journal and pages; and the same title, year, journal and volume), and by two manual merges decided after reading the remaining pairs with identical titles (52 such pairs were reviewed and kept apart, being different publications, patents or animal studies). In total 2,358 duplicates were removed (1,293 by DOI, 880 by title, first author and year, and 185 by the remaining rules and the two manual merges), leaving 2,548 records to screen. As a check, EndNote's duplicate finder (default criteria) was run on an intermediate version of 2,550 records; it flagged 32 records, all of them in groups of distinct publications by the same authors or unrelated patents. A looser check by script (identical title and year) found two further duplicates that differed only in the way the authors' names were written; they were merged by the last rule. Two possible duplicate publications of the same patient (one pair of Chinese-language reports and one pair of German-language reports) are to be checked at full text. The script and its output are in the project repository </w:t>
+      </w:r>
+      <w:r>
+        <w:rPr>
+          <w:rFonts w:ascii="Consolas" w:cs="Consolas" w:eastAsia="Microsoft YaHei" w:hAnsi="Consolas"/>
+          <w:sz w:val="19"/>
+          <w:szCs w:val="19"/>
+          <w:shd w:fill="EEEEEE" w:val="clear"/>
+        </w:rPr>
+        <w:t xml:space="preserve">[PENDING: give the repository or archive address that will be public]</w:t>
+      </w:r>
+      <w:r>
+        <w:rPr>
+          <w:rFonts w:ascii="Calibri" w:cs="Calibri" w:eastAsia="Microsoft YaHei" w:hAnsi="Calibri"/>
+        </w:rPr>
+        <w:t xml:space="preserve">.</w:t>
+      </w:r>
+    </w:p>
+    <w:p>
+      <w:pPr>
+        <w:pStyle w:val="Heading3"/>
+        <w:keepNext/>
+      </w:pPr>
+      <w:r>
+        <w:rPr>
+          <w:rFonts w:ascii="Calibri" w:cs="Calibri" w:eastAsia="Microsoft YaHei" w:hAnsi="Calibri"/>
+        </w:rPr>
+        <w:t xml:space="preserve">Selection of reports</w:t>
+      </w:r>
+    </w:p>
+    <w:p>
+      <w:pPr>
+        <w:spacing w:after="120"/>
+      </w:pPr>
+      <w:r>
+        <w:rPr>
+          <w:rFonts w:ascii="Calibri" w:cs="Calibri" w:eastAsia="Microsoft YaHei" w:hAnsi="Calibri"/>
+        </w:rPr>
+        <w:t xml:space="preserve">Titles and abstracts were screened in Rayyan by two reviewers independently (JS and FP), with Rayyan's blind mode on until both had finished the stage, author and journal details hidden, and Rayyan's artificial-intelligence functions, automatic duplicate detection and automatic duplicate resolution not used </w:t>
+      </w:r>
+      <w:r>
+        <w:rPr>
+          <w:rFonts w:ascii="Consolas" w:cs="Consolas" w:eastAsia="Microsoft YaHei" w:hAnsi="Consolas"/>
+          <w:sz w:val="19"/>
+          <w:szCs w:val="19"/>
+          <w:shd w:fill="EEEEEE" w:val="clear"/>
+        </w:rPr>
+        <w:t xml:space="preserve">[PENDING: do not keep this statement until the question about the label "AI-prescreen" (applied by the second reviewer's account to 179 records on 10–11 October 2026 and later removed; see the 12 October paragraph of CLAUDE.md) has been answered. The statement follows protocol v1.4, not a check of what was done.]</w:t>
+      </w:r>
+      <w:r>
+        <w:rPr>
+          <w:rFonts w:ascii="Calibri" w:cs="Calibri" w:eastAsia="Microsoft YaHei" w:hAnsi="Calibri"/>
+        </w:rPr>
+        <w:t xml:space="preserve">. Before formal screening, both reviewers screened a random calibration set of 50 of the 2,548 records (random seed 20261004) and discussed the discrepancies: they agreed on 45 of 50 records (90.0%; Cohen's kappa 0.83), and all five disagreements were among the 11 records without an abstract. In the calibration, author and journal details were visible to both reviewers during part of the exercise. A written screening guide, revised after the calibration, applied the eligibility criteria without changing them; its main rules were that Maybe was chosen when in doubt, that every exclusion at this stage carried one of six reasons (not human; not wandering spleen; adults only; no original patient data; not a formal article; other), and that records without an abstract were judged on the title alone. Where one reviewer excluded a record and the other included it or marked it Maybe, the reviewers discussed it and, failing agreement, a third author (JY) decided. Records marked Include or Maybe by either reviewer, and not excluded after discussion, went to full-text assessment.</w:t>
       </w:r>
     </w:p>
     <w:p>
@@ -7238,7 +7292,7 @@
         <w:sz w:val="17"/>
         <w:szCs w:val="17"/>
       </w:rPr>
-      <w:t xml:space="preserve">Methods draft and PRISMA-S appendix (draft) v2026-10-11b — PROSPERO CRD420261520329   |   第 </w:t>
+      <w:t xml:space="preserve">Methods draft and PRISMA-S appendix (draft) v2026-10-14a — PROSPERO CRD420261520329   |   第 </w:t>
     </w:r>
     <w:r>
       <w:rPr>

</xml_diff>

<commit_message>
Merge old-branch commits of 14-15 Oct; mark FP independence as pending in Methods draft
Fei Peng's answers (Codex used for the 11 Oct pace and bulk exclusions) mean the
sentence about two independent reviewers cannot be written as it stands. Methods
draft updated (item 7, PENDING marker), docx regenerated, log paragraph added.

Co-Authored-By: Claude Sonnet 5.5 <noreply@anthropic.com>
Claude-Session: https://claude.ai/code/session_017BKkAkTLfidWPZV4f6Xm8t
</commit_message>
<xml_diff>
--- a/Methods draft and PRISMA-S appendix (draft).docx
+++ b/Methods draft and PRISMA-S appendix (draft).docx
@@ -22,7 +22,7 @@
         <w:rPr>
           <w:rFonts w:ascii="Calibri" w:cs="Calibri" w:eastAsia="Microsoft YaHei" w:hAnsi="Calibri"/>
         </w:rPr>
-        <w:t xml:space="preserve">版本 v2026-10-14a（2026-10-11 的 v2026-10-11b 加了第 1 节第 6 条和一处待确认标记）。</w:t>
+        <w:t xml:space="preserve">版本 v2026-10-16a（10 月 14 日 v2026-10-14a 之后，又加了第 1 节第 7 条和筛选段落的待确认标记）。</w:t>
       </w:r>
       <w:r>
         <w:rPr>
@@ -301,37 +301,26 @@
     </w:p>
     <w:p>
       <w:pPr>
-        <w:pStyle w:val="Heading2"/>
-        <w:keepNext/>
-      </w:pPr>
-      <w:r>
-        <w:rPr>
-          <w:rFonts w:ascii="Calibri" w:cs="Calibri" w:eastAsia="Microsoft YaHei" w:hAnsi="Calibri"/>
-        </w:rPr>
-        <w:t xml:space="preserve">2. Methods（英文，论文用）</w:t>
-      </w:r>
-    </w:p>
-    <w:p>
-      <w:pPr>
-        <w:pStyle w:val="Heading3"/>
-        <w:keepNext/>
-      </w:pPr>
-      <w:r>
-        <w:rPr>
-          <w:rFonts w:ascii="Calibri" w:cs="Calibri" w:eastAsia="Microsoft YaHei" w:hAnsi="Calibri"/>
-        </w:rPr>
-        <w:t xml:space="preserve">Study design and registration</w:t>
-      </w:r>
-    </w:p>
-    <w:p>
-      <w:pPr>
-        <w:spacing w:after="120"/>
-      </w:pPr>
-      <w:r>
-        <w:rPr>
-          <w:rFonts w:ascii="Calibri" w:cs="Calibri" w:eastAsia="Microsoft YaHei" w:hAnsi="Calibri"/>
-        </w:rPr>
-        <w:t xml:space="preserve">We carried out a systematic review of individual patient data (IPD) extracted from published reports of wandering spleen in children, pooled with a single-centre case series. The review was registered in PROSPERO (CRD420261520329) on 28 September 2026. The protocol was revised four times after registration; none of the revisions changed the eligibility criteria, exposures, outcomes or analysis plan: version 1.1 (28 September 2026) revised the search strategies after review by a medical librarian; version 1.2 (4 October 2026) added the as-run details of the searches and of deduplication; version 1.3 (7 October 2026) added the screening procedure as set up; and version 1.4 (11 October 2026) corrected the stage of review recorded at that time, because formal screening had already started. </w:t>
+        <w:pStyle w:val="ListParagraph"/>
+        <w:numPr>
+          <w:ilvl w:val="0"/>
+          <w:numId w:val="2"/>
+        </w:numPr>
+        <w:spacing w:after="60"/>
+      </w:pPr>
+      <w:r>
+        <w:rPr>
+          <w:rFonts w:ascii="Calibri" w:cs="Calibri" w:eastAsia="Microsoft YaHei" w:hAnsi="Calibri"/>
+          <w:b/>
+          <w:bCs/>
+        </w:rPr>
+        <w:t xml:space="preserve">（2026-10-16 补）旧会话 10 月 15 日的记录：Fei Peng 说 10 月 11 日约每条 2 秒的决定和 942 条批量排除是用 Codex 完成的</w:t>
+      </w:r>
+      <w:r>
+        <w:rPr>
+          <w:rFonts w:ascii="Calibri" w:cs="Calibri" w:eastAsia="Microsoft YaHei" w:hAnsi="Calibri"/>
+        </w:rPr>
+        <w:t xml:space="preserve">（</w:t>
       </w:r>
       <w:r>
         <w:rPr>
@@ -340,13 +329,62 @@
           <w:szCs w:val="19"/>
           <w:shd w:fill="EEEEEE" w:val="clear"/>
         </w:rPr>
-        <w:t xml:space="preserve">[PENDING: the v1.4 amendment has not yet been submitted to PROSPERO; update this sentence with the date it is submitted and the final version number.]</w:t>
-      </w:r>
-      <w:r>
-        <w:rPr>
-          <w:rFonts w:ascii="Calibri" w:cs="Calibri" w:eastAsia="Microsoft YaHei" w:hAnsi="Calibri"/>
-        </w:rPr>
-        <w:t xml:space="preserve"> The review is reported according to PRISMA 2020 [3], PRISMA-IPD [4] and, for the searches, PRISMA-S [13]; the checklists are provided as supplementary files </w:t>
+        <w:t xml:space="preserve">AI-prescreen</w:t>
+      </w:r>
+      <w:r>
+        <w:rPr>
+          <w:rFonts w:ascii="Calibri" w:cs="Calibri" w:eastAsia="Microsoft YaHei" w:hAnsi="Calibri"/>
+        </w:rPr>
+        <w:t xml:space="preserve"> 标签她说是'写错了'，已删除）。这意味着第二位评审员约 93% 的决定可能不是她本人逐条阅读做出的。</w:t>
+      </w:r>
+      <w:r>
+        <w:rPr>
+          <w:rFonts w:ascii="Calibri" w:cs="Calibri" w:eastAsia="Microsoft YaHei" w:hAnsi="Calibri"/>
+          <w:b/>
+          <w:bCs/>
+        </w:rPr>
+        <w:t xml:space="preserve">下面 Selection of reports 里'两位评审员独立筛选'一句，目前不能原样写</w:t>
+      </w:r>
+      <w:r>
+        <w:rPr>
+          <w:rFonts w:ascii="Calibri" w:cs="Calibri" w:eastAsia="Microsoft YaHei" w:hAnsi="Calibri"/>
+        </w:rPr>
+        <w:t xml:space="preserve">；写成什么要等 Fei Peng 回答 Codex 到底做了判断还是只录入她已有的判断，以及你们决定怎么处理（她重新独立筛选，或只把 Codex 的结果当作单独记录的 AI 筛选数据集，加第三人盲评）。无论怎么处理，都要在 Methods 和 PROSPERO 修订（v1.5）里如实写出。</w:t>
+      </w:r>
+    </w:p>
+    <w:p>
+      <w:pPr>
+        <w:pStyle w:val="Heading2"/>
+        <w:keepNext/>
+      </w:pPr>
+      <w:r>
+        <w:rPr>
+          <w:rFonts w:ascii="Calibri" w:cs="Calibri" w:eastAsia="Microsoft YaHei" w:hAnsi="Calibri"/>
+        </w:rPr>
+        <w:t xml:space="preserve">2. Methods（英文，论文用）</w:t>
+      </w:r>
+    </w:p>
+    <w:p>
+      <w:pPr>
+        <w:pStyle w:val="Heading3"/>
+        <w:keepNext/>
+      </w:pPr>
+      <w:r>
+        <w:rPr>
+          <w:rFonts w:ascii="Calibri" w:cs="Calibri" w:eastAsia="Microsoft YaHei" w:hAnsi="Calibri"/>
+        </w:rPr>
+        <w:t xml:space="preserve">Study design and registration</w:t>
+      </w:r>
+    </w:p>
+    <w:p>
+      <w:pPr>
+        <w:spacing w:after="120"/>
+      </w:pPr>
+      <w:r>
+        <w:rPr>
+          <w:rFonts w:ascii="Calibri" w:cs="Calibri" w:eastAsia="Microsoft YaHei" w:hAnsi="Calibri"/>
+        </w:rPr>
+        <w:t xml:space="preserve">We carried out a systematic review of individual patient data (IPD) extracted from published reports of wandering spleen in children, pooled with a single-centre case series. The review was registered in PROSPERO (CRD420261520329) on 28 September 2026. The protocol was revised four times after registration; none of the revisions changed the eligibility criteria, exposures, outcomes or analysis plan: version 1.1 (28 September 2026) revised the search strategies after review by a medical librarian; version 1.2 (4 October 2026) added the as-run details of the searches and of deduplication; version 1.3 (7 October 2026) added the screening procedure as set up; and version 1.4 (11 October 2026) corrected the stage of review recorded at that time, because formal screening had already started. </w:t>
       </w:r>
       <w:r>
         <w:rPr>
@@ -355,47 +393,13 @@
           <w:szCs w:val="19"/>
           <w:shd w:fill="EEEEEE" w:val="clear"/>
         </w:rPr>
-        <w:t xml:space="preserve">[PENDING]</w:t>
-      </w:r>
-      <w:r>
-        <w:rPr>
-          <w:rFonts w:ascii="Calibri" w:cs="Calibri" w:eastAsia="Microsoft YaHei" w:hAnsi="Calibri"/>
-        </w:rPr>
-        <w:t xml:space="preserve">.</w:t>
-      </w:r>
-    </w:p>
-    <w:p>
-      <w:pPr>
-        <w:spacing w:after="120"/>
-      </w:pPr>
-      <w:r>
-        <w:rPr>
-          <w:rFonts w:ascii="Calibri" w:cs="Calibri" w:eastAsia="Microsoft YaHei" w:hAnsi="Calibri"/>
-        </w:rPr>
-        <w:t xml:space="preserve">The research question was set in the registered protocol, before screening and data extraction began: in children younger than 18 years who undergo surgery for wandering spleen, is a longer duration of the index symptomatic episode before operation associated with a non-viable spleen at operation? Before the protocol was written, we extracted data from 53 reports collected by hand (a pilot, not a systematic search). The pilot informed the choice of the primary exposure and is declared in the registration.</w:t>
-      </w:r>
-    </w:p>
-    <w:p>
-      <w:pPr>
-        <w:pStyle w:val="Heading3"/>
-        <w:keepNext/>
-      </w:pPr>
-      <w:r>
-        <w:rPr>
-          <w:rFonts w:ascii="Calibri" w:cs="Calibri" w:eastAsia="Microsoft YaHei" w:hAnsi="Calibri"/>
-        </w:rPr>
-        <w:t xml:space="preserve">Own case series</w:t>
-      </w:r>
-    </w:p>
-    <w:p>
-      <w:pPr>
-        <w:spacing w:after="120"/>
-      </w:pPr>
-      <w:r>
-        <w:rPr>
-          <w:rFonts w:ascii="Calibri" w:cs="Calibri" w:eastAsia="Microsoft YaHei" w:hAnsi="Calibri"/>
-        </w:rPr>
-        <w:t xml:space="preserve">The case series comprises five children treated for wandering spleen at Wuhan Children's Hospital (Wuhan Maternal and Child Healthcare Hospital), Tongji Medical College, Huazhong University of Science and Technology, China. The study was approved by the hospital's ethics committee (registration number 2025R156-E01), with supplementary approval covering the fifth patient </w:t>
+        <w:t xml:space="preserve">[PENDING: the v1.4 amendment has not yet been submitted to PROSPERO; update this sentence with the date it is submitted and the final version number.]</w:t>
+      </w:r>
+      <w:r>
+        <w:rPr>
+          <w:rFonts w:ascii="Calibri" w:cs="Calibri" w:eastAsia="Microsoft YaHei" w:hAnsi="Calibri"/>
+        </w:rPr>
+        <w:t xml:space="preserve"> The review is reported according to PRISMA 2020 [3], PRISMA-IPD [4] and, for the searches, PRISMA-S [13]; the checklists are provided as supplementary files </w:t>
       </w:r>
       <w:r>
         <w:rPr>
@@ -404,13 +408,47 @@
           <w:szCs w:val="19"/>
           <w:shd w:fill="EEEEEE" w:val="clear"/>
         </w:rPr>
-        <w:t xml:space="preserve">[PENDING: confirm whether the supplementary approval has its own number]</w:t>
-      </w:r>
-      <w:r>
-        <w:rPr>
-          <w:rFonts w:ascii="Calibri" w:cs="Calibri" w:eastAsia="Microsoft YaHei" w:hAnsi="Calibri"/>
-        </w:rPr>
-        <w:t xml:space="preserve">. </w:t>
+        <w:t xml:space="preserve">[PENDING]</w:t>
+      </w:r>
+      <w:r>
+        <w:rPr>
+          <w:rFonts w:ascii="Calibri" w:cs="Calibri" w:eastAsia="Microsoft YaHei" w:hAnsi="Calibri"/>
+        </w:rPr>
+        <w:t xml:space="preserve">.</w:t>
+      </w:r>
+    </w:p>
+    <w:p>
+      <w:pPr>
+        <w:spacing w:after="120"/>
+      </w:pPr>
+      <w:r>
+        <w:rPr>
+          <w:rFonts w:ascii="Calibri" w:cs="Calibri" w:eastAsia="Microsoft YaHei" w:hAnsi="Calibri"/>
+        </w:rPr>
+        <w:t xml:space="preserve">The research question was set in the registered protocol, before screening and data extraction began: in children younger than 18 years who undergo surgery for wandering spleen, is a longer duration of the index symptomatic episode before operation associated with a non-viable spleen at operation? Before the protocol was written, we extracted data from 53 reports collected by hand (a pilot, not a systematic search). The pilot informed the choice of the primary exposure and is declared in the registration.</w:t>
+      </w:r>
+    </w:p>
+    <w:p>
+      <w:pPr>
+        <w:pStyle w:val="Heading3"/>
+        <w:keepNext/>
+      </w:pPr>
+      <w:r>
+        <w:rPr>
+          <w:rFonts w:ascii="Calibri" w:cs="Calibri" w:eastAsia="Microsoft YaHei" w:hAnsi="Calibri"/>
+        </w:rPr>
+        <w:t xml:space="preserve">Own case series</w:t>
+      </w:r>
+    </w:p>
+    <w:p>
+      <w:pPr>
+        <w:spacing w:after="120"/>
+      </w:pPr>
+      <w:r>
+        <w:rPr>
+          <w:rFonts w:ascii="Calibri" w:cs="Calibri" w:eastAsia="Microsoft YaHei" w:hAnsi="Calibri"/>
+        </w:rPr>
+        <w:t xml:space="preserve">The case series comprises five children treated for wandering spleen at Wuhan Children's Hospital (Wuhan Maternal and Child Healthcare Hospital), Tongji Medical College, Huazhong University of Science and Technology, China. The study was approved by the hospital's ethics committee (registration number 2025R156-E01), with supplementary approval covering the fifth patient </w:t>
       </w:r>
       <w:r>
         <w:rPr>
@@ -419,70 +457,13 @@
           <w:szCs w:val="19"/>
           <w:shd w:fill="EEEEEE" w:val="clear"/>
         </w:rPr>
-        <w:t xml:space="preserve">[PENDING: state that written informed consent for publication of clinical details and images was obtained from the parents of all five children — not recorded in the project notes; confirm before writing this sentence.]</w:t>
-      </w:r>
-      <w:r>
-        <w:rPr>
-          <w:rFonts w:ascii="Calibri" w:cs="Calibri" w:eastAsia="Microsoft YaHei" w:hAnsi="Calibri"/>
-        </w:rPr>
-        <w:t xml:space="preserve"> These five children were extracted with the same form as the published patients and analysed together with them; a sensitivity analysis excludes them.</w:t>
-      </w:r>
-    </w:p>
-    <w:p>
-      <w:pPr>
-        <w:pStyle w:val="Heading3"/>
-        <w:keepNext/>
-      </w:pPr>
-      <w:r>
-        <w:rPr>
-          <w:rFonts w:ascii="Calibri" w:cs="Calibri" w:eastAsia="Microsoft YaHei" w:hAnsi="Calibri"/>
-        </w:rPr>
-        <w:t xml:space="preserve">Eligibility criteria</w:t>
-      </w:r>
-    </w:p>
-    <w:p>
-      <w:pPr>
-        <w:spacing w:after="120"/>
-      </w:pPr>
-      <w:r>
-        <w:rPr>
-          <w:rFonts w:ascii="Calibri" w:cs="Calibri" w:eastAsia="Microsoft YaHei" w:hAnsi="Calibri"/>
-        </w:rPr>
-        <w:t xml:space="preserve">Eligible patients were younger than 18 years at operation (or at diagnosis, for children managed without operation), with a wandering spleen confirmed by imaging and/or at operation. We defined a wandering spleen as an abnormally mobile spleen displaced from the left upper quadrant because of absent or lax suspensory ligaments, with or without torsion of the vascular pedicle. Congenital and acquired forms (for example after fundoplication or nephrectomy) were both eligible, and acquired cases form a subgroup. Individual data on age and, for the primary analysis, on splenic viability at operation had to be reported, or be supplied by the authors. We excluded torsion of an accessory spleen (including a wandering accessory spleen), torsion of an orthotopic spleen without ectopia, splenosis, and patients whose age was not reported individually and could not be established as younger than 18 years. Children managed without operation were summarised descriptively; they have no operative outcome and did not enter the primary analysis.</w:t>
-      </w:r>
-    </w:p>
-    <w:p>
-      <w:pPr>
-        <w:spacing w:after="120"/>
-      </w:pPr>
-      <w:r>
-        <w:rPr>
-          <w:rFonts w:ascii="Calibri" w:cs="Calibri" w:eastAsia="Microsoft YaHei" w:hAnsi="Calibri"/>
-        </w:rPr>
-        <w:t xml:space="preserve">Eligible reports were case reports, case series, cohort studies, letters and reviews that describe original patients, provided that individual patient data were reported or supplied. Reviews without new patients (used only for checking reference lists), conference abstracts and editorials without patient data were excluded. Reports with full text in English or Chinese were extracted; reports in other languages were listed and counted but not extracted. Any clinical setting in any country was eligible.</w:t>
-      </w:r>
-    </w:p>
-    <w:p>
-      <w:pPr>
-        <w:pStyle w:val="Heading3"/>
-        <w:keepNext/>
-      </w:pPr>
-      <w:r>
-        <w:rPr>
-          <w:rFonts w:ascii="Calibri" w:cs="Calibri" w:eastAsia="Microsoft YaHei" w:hAnsi="Calibri"/>
-        </w:rPr>
-        <w:t xml:space="preserve">Information sources and search</w:t>
-      </w:r>
-    </w:p>
-    <w:p>
-      <w:pPr>
-        <w:spacing w:after="120"/>
-      </w:pPr>
-      <w:r>
-        <w:rPr>
-          <w:rFonts w:ascii="Calibri" w:cs="Calibri" w:eastAsia="Microsoft YaHei" w:hAnsi="Calibri"/>
-        </w:rPr>
-        <w:t xml:space="preserve">We searched MEDLINE (via PubMed), Web of Science Core Collection, Scopus, China National Knowledge Infrastructure (CNKI), Wanfang Data and the China Biology Medicine database (CBM, via SinoMed). The searches combined controlled vocabulary, where it exists, with free-text synonyms for wandering spleen, splenic torsion and splenopexy, and had no language, date, age or study-design limits. A medical librarian reviewed the strategies before the formal searches, and the PubMed strategy was test-run on 28 September 2026; the review led to the replacement of eight phrases that are not in the PubMed phrase index by proximity searches, to additional synonyms, and to harmonised term lists across databases. The searches were run by one author (JS) between 28 and 29 September 2026 and returned 4,906 records: 1,263 from PubMed, 750 from Web of Science, 1,563 from Scopus, 486 from CNKI, 423 from Wanfang and 421 from CBM. For every database, the number of records exported equalled the number of hits. The full strategies as run, the platforms, the dates and the limits are given in Supplementary Appendix A (summarised in Table S1 below). Coverage in Web of Science is limited by the institutional licence (eight indexes, each from the year of its start; Table S1), so it does not extend to the inception of the database. </w:t>
+        <w:t xml:space="preserve">[PENDING: confirm whether the supplementary approval has its own number]</w:t>
+      </w:r>
+      <w:r>
+        <w:rPr>
+          <w:rFonts w:ascii="Calibri" w:cs="Calibri" w:eastAsia="Microsoft YaHei" w:hAnsi="Calibri"/>
+        </w:rPr>
+        <w:t xml:space="preserve">. </w:t>
       </w:r>
       <w:r>
         <w:rPr>
@@ -491,7 +472,13 @@
           <w:szCs w:val="19"/>
           <w:shd w:fill="EEEEEE" w:val="clear"/>
         </w:rPr>
-        <w:t xml:space="preserve">[PENDING: the update search — see Updates below.]</w:t>
+        <w:t xml:space="preserve">[PENDING: state that written informed consent for publication of clinical details and images was obtained from the parents of all five children — not recorded in the project notes; confirm before writing this sentence.]</w:t>
+      </w:r>
+      <w:r>
+        <w:rPr>
+          <w:rFonts w:ascii="Calibri" w:cs="Calibri" w:eastAsia="Microsoft YaHei" w:hAnsi="Calibri"/>
+        </w:rPr>
+        <w:t xml:space="preserve"> These five children were extracted with the same form as the published patients and analysed together with them; a sensitivity analysis excludes them.</w:t>
       </w:r>
     </w:p>
     <w:p>
@@ -503,7 +490,7 @@
         <w:rPr>
           <w:rFonts w:ascii="Calibri" w:cs="Calibri" w:eastAsia="Microsoft YaHei" w:hAnsi="Calibri"/>
         </w:rPr>
-        <w:t xml:space="preserve">Deviations from the protocol in the search</w:t>
+        <w:t xml:space="preserve">Eligibility criteria</w:t>
       </w:r>
     </w:p>
     <w:p>
@@ -514,7 +501,41 @@
         <w:rPr>
           <w:rFonts w:ascii="Calibri" w:cs="Calibri" w:eastAsia="Microsoft YaHei" w:hAnsi="Calibri"/>
         </w:rPr>
-        <w:t xml:space="preserve">Three planned sources were not completed. First, Embase (Embase.com) was not searched: the Emtree terms were checked on 29 September 2026, but on 4 October 2026 institutional access was no longer recognised and could not be restored, so no Embase records were retrieved. Second, Google Scholar was not searched: on 4 October 2026 Google returned its unusual-traffic block page and no results were seen. Third, citation searching was not completed: the cited-by lists of Ganarin et al. [1] in Web of Science and in Scopus (13 documents each) were viewed on 4 October 2026 but not exported or screened; backward searching of the reference lists of earlier reviews and larger series [1, 5–12] was not done; and backward searching of the included reports depends on the final included set </w:t>
+        <w:t xml:space="preserve">Eligible patients were younger than 18 years at operation (or at diagnosis, for children managed without operation), with a wandering spleen confirmed by imaging and/or at operation. We defined a wandering spleen as an abnormally mobile spleen displaced from the left upper quadrant because of absent or lax suspensory ligaments, with or without torsion of the vascular pedicle. Congenital and acquired forms (for example after fundoplication or nephrectomy) were both eligible, and acquired cases form a subgroup. Individual data on age and, for the primary analysis, on splenic viability at operation had to be reported, or be supplied by the authors. We excluded torsion of an accessory spleen (including a wandering accessory spleen), torsion of an orthotopic spleen without ectopia, splenosis, and patients whose age was not reported individually and could not be established as younger than 18 years. Children managed without operation were summarised descriptively; they have no operative outcome and did not enter the primary analysis.</w:t>
+      </w:r>
+    </w:p>
+    <w:p>
+      <w:pPr>
+        <w:spacing w:after="120"/>
+      </w:pPr>
+      <w:r>
+        <w:rPr>
+          <w:rFonts w:ascii="Calibri" w:cs="Calibri" w:eastAsia="Microsoft YaHei" w:hAnsi="Calibri"/>
+        </w:rPr>
+        <w:t xml:space="preserve">Eligible reports were case reports, case series, cohort studies, letters and reviews that describe original patients, provided that individual patient data were reported or supplied. Reviews without new patients (used only for checking reference lists), conference abstracts and editorials without patient data were excluded. Reports with full text in English or Chinese were extracted; reports in other languages were listed and counted but not extracted. Any clinical setting in any country was eligible.</w:t>
+      </w:r>
+    </w:p>
+    <w:p>
+      <w:pPr>
+        <w:pStyle w:val="Heading3"/>
+        <w:keepNext/>
+      </w:pPr>
+      <w:r>
+        <w:rPr>
+          <w:rFonts w:ascii="Calibri" w:cs="Calibri" w:eastAsia="Microsoft YaHei" w:hAnsi="Calibri"/>
+        </w:rPr>
+        <w:t xml:space="preserve">Information sources and search</w:t>
+      </w:r>
+    </w:p>
+    <w:p>
+      <w:pPr>
+        <w:spacing w:after="120"/>
+      </w:pPr>
+      <w:r>
+        <w:rPr>
+          <w:rFonts w:ascii="Calibri" w:cs="Calibri" w:eastAsia="Microsoft YaHei" w:hAnsi="Calibri"/>
+        </w:rPr>
+        <w:t xml:space="preserve">We searched MEDLINE (via PubMed), Web of Science Core Collection, Scopus, China National Knowledge Infrastructure (CNKI), Wanfang Data and the China Biology Medicine database (CBM, via SinoMed). The searches combined controlled vocabulary, where it exists, with free-text synonyms for wandering spleen, splenic torsion and splenopexy, and had no language, date, age or study-design limits. A medical librarian reviewed the strategies before the formal searches, and the PubMed strategy was test-run on 28 September 2026; the review led to the replacement of eight phrases that are not in the PubMed phrase index by proximity searches, to additional synonyms, and to harmonised term lists across databases. The searches were run by one author (JS) between 28 and 29 September 2026 and returned 4,906 records: 1,263 from PubMed, 750 from Web of Science, 1,563 from Scopus, 486 from CNKI, 423 from Wanfang and 421 from CBM. For every database, the number of records exported equalled the number of hits. The full strategies as run, the platforms, the dates and the limits are given in Supplementary Appendix A (summarised in Table S1 below). Coverage in Web of Science is limited by the institutional licence (eight indexes, each from the year of its start; Table S1), so it does not extend to the inception of the database. </w:t>
       </w:r>
       <w:r>
         <w:rPr>
@@ -523,13 +544,30 @@
           <w:szCs w:val="19"/>
           <w:shd w:fill="EEEEEE" w:val="clear"/>
         </w:rPr>
-        <w:t xml:space="preserve">[PENDING: state whether it was done]</w:t>
-      </w:r>
-      <w:r>
-        <w:rPr>
-          <w:rFonts w:ascii="Calibri" w:cs="Calibri" w:eastAsia="Microsoft YaHei" w:hAnsi="Calibri"/>
-        </w:rPr>
-        <w:t xml:space="preserve">. No record from these sources entered the screening set. We discuss the consequences in the Limitations. These deviations were reported in the PROSPERO record </w:t>
+        <w:t xml:space="preserve">[PENDING: the update search — see Updates below.]</w:t>
+      </w:r>
+    </w:p>
+    <w:p>
+      <w:pPr>
+        <w:pStyle w:val="Heading3"/>
+        <w:keepNext/>
+      </w:pPr>
+      <w:r>
+        <w:rPr>
+          <w:rFonts w:ascii="Calibri" w:cs="Calibri" w:eastAsia="Microsoft YaHei" w:hAnsi="Calibri"/>
+        </w:rPr>
+        <w:t xml:space="preserve">Deviations from the protocol in the search</w:t>
+      </w:r>
+    </w:p>
+    <w:p>
+      <w:pPr>
+        <w:spacing w:after="120"/>
+      </w:pPr>
+      <w:r>
+        <w:rPr>
+          <w:rFonts w:ascii="Calibri" w:cs="Calibri" w:eastAsia="Microsoft YaHei" w:hAnsi="Calibri"/>
+        </w:rPr>
+        <w:t xml:space="preserve">Three planned sources were not completed. First, Embase (Embase.com) was not searched: the Emtree terms were checked on 29 September 2026, but on 4 October 2026 institutional access was no longer recognised and could not be restored, so no Embase records were retrieved. Second, Google Scholar was not searched: on 4 October 2026 Google returned its unusual-traffic block page and no results were seen. Third, citation searching was not completed: the cited-by lists of Ganarin et al. [1] in Web of Science and in Scopus (13 documents each) were viewed on 4 October 2026 but not exported or screened; backward searching of the reference lists of earlier reviews and larger series [1, 5–12] was not done; and backward searching of the included reports depends on the final included set </w:t>
       </w:r>
       <w:r>
         <w:rPr>
@@ -538,36 +576,13 @@
           <w:szCs w:val="19"/>
           <w:shd w:fill="EEEEEE" w:val="clear"/>
         </w:rPr>
-        <w:t xml:space="preserve">[PENDING: after the v1.4 amendment is submitted]</w:t>
-      </w:r>
-      <w:r>
-        <w:rPr>
-          <w:rFonts w:ascii="Calibri" w:cs="Calibri" w:eastAsia="Microsoft YaHei" w:hAnsi="Calibri"/>
-        </w:rPr>
-        <w:t xml:space="preserve">.</w:t>
-      </w:r>
-    </w:p>
-    <w:p>
-      <w:pPr>
-        <w:pStyle w:val="Heading3"/>
-        <w:keepNext/>
-      </w:pPr>
-      <w:r>
-        <w:rPr>
-          <w:rFonts w:ascii="Calibri" w:cs="Calibri" w:eastAsia="Microsoft YaHei" w:hAnsi="Calibri"/>
-        </w:rPr>
-        <w:t xml:space="preserve">Deduplication</w:t>
-      </w:r>
-    </w:p>
-    <w:p>
-      <w:pPr>
-        <w:spacing w:after="120"/>
-      </w:pPr>
-      <w:r>
-        <w:rPr>
-          <w:rFonts w:ascii="Calibri" w:cs="Calibri" w:eastAsia="Microsoft YaHei" w:hAnsi="Calibri"/>
-        </w:rPr>
-        <w:t xml:space="preserve">Records were deduplicated with a documented rule-based script (in order: identical DOI; identical title with the same first author and year; the same title written in another script; similar title with the same first author and year; the same first author, year, volume and first page; the same title, volume and pages; Chinese title with the same year, journal and pages; and the same title, year, journal and volume), and by two manual merges decided after reading the remaining pairs with identical titles (52 such pairs were reviewed and kept apart, being different publications, patents or animal studies). In total 2,358 duplicates were removed (1,293 by DOI, 880 by title, first author and year, and 185 by the remaining rules and the two manual merges), leaving 2,548 records to screen. As a check, EndNote's duplicate finder (default criteria) was run on an intermediate version of 2,550 records; it flagged 32 records, all of them in groups of distinct publications by the same authors or unrelated patents. A looser check by script (identical title and year) found two further duplicates that differed only in the way the authors' names were written; they were merged by the last rule. Two possible duplicate publications of the same patient (one pair of Chinese-language reports and one pair of German-language reports) are to be checked at full text. The script and its output are in the project repository </w:t>
+        <w:t xml:space="preserve">[PENDING: state whether it was done]</w:t>
+      </w:r>
+      <w:r>
+        <w:rPr>
+          <w:rFonts w:ascii="Calibri" w:cs="Calibri" w:eastAsia="Microsoft YaHei" w:hAnsi="Calibri"/>
+        </w:rPr>
+        <w:t xml:space="preserve">. No record from these sources entered the screening set. We discuss the consequences in the Limitations. These deviations were reported in the PROSPERO record </w:t>
       </w:r>
       <w:r>
         <w:rPr>
@@ -576,7 +591,7 @@
           <w:szCs w:val="19"/>
           <w:shd w:fill="EEEEEE" w:val="clear"/>
         </w:rPr>
-        <w:t xml:space="preserve">[PENDING: give the repository or archive address that will be public]</w:t>
+        <w:t xml:space="preserve">[PENDING: after the v1.4 amendment is submitted]</w:t>
       </w:r>
       <w:r>
         <w:rPr>
@@ -594,7 +609,7 @@
         <w:rPr>
           <w:rFonts w:ascii="Calibri" w:cs="Calibri" w:eastAsia="Microsoft YaHei" w:hAnsi="Calibri"/>
         </w:rPr>
-        <w:t xml:space="preserve">Selection of reports</w:t>
+        <w:t xml:space="preserve">Deduplication</w:t>
       </w:r>
     </w:p>
     <w:p>
@@ -605,7 +620,60 @@
         <w:rPr>
           <w:rFonts w:ascii="Calibri" w:cs="Calibri" w:eastAsia="Microsoft YaHei" w:hAnsi="Calibri"/>
         </w:rPr>
-        <w:t xml:space="preserve">Titles and abstracts were screened in Rayyan by two reviewers independently (JS and FP), with Rayyan's blind mode on until both had finished the stage, author and journal details hidden, and Rayyan's artificial-intelligence functions, automatic duplicate detection and automatic duplicate resolution not used </w:t>
+        <w:t xml:space="preserve">Records were deduplicated with a documented rule-based script (in order: identical DOI; identical title with the same first author and year; the same title written in another script; similar title with the same first author and year; the same first author, year, volume and first page; the same title, volume and pages; Chinese title with the same year, journal and pages; and the same title, year, journal and volume), and by two manual merges decided after reading the remaining pairs with identical titles (52 such pairs were reviewed and kept apart, being different publications, patents or animal studies). In total 2,358 duplicates were removed (1,293 by DOI, 880 by title, first author and year, and 185 by the remaining rules and the two manual merges), leaving 2,548 records to screen. As a check, EndNote's duplicate finder (default criteria) was run on an intermediate version of 2,550 records; it flagged 32 records, all of them in groups of distinct publications by the same authors or unrelated patents. A looser check by script (identical title and year) found two further duplicates that differed only in the way the authors' names were written; they were merged by the last rule. Two possible duplicate publications of the same patient (one pair of Chinese-language reports and one pair of German-language reports) are to be checked at full text. The script and its output are in the project repository </w:t>
+      </w:r>
+      <w:r>
+        <w:rPr>
+          <w:rFonts w:ascii="Consolas" w:cs="Consolas" w:eastAsia="Microsoft YaHei" w:hAnsi="Consolas"/>
+          <w:sz w:val="19"/>
+          <w:szCs w:val="19"/>
+          <w:shd w:fill="EEEEEE" w:val="clear"/>
+        </w:rPr>
+        <w:t xml:space="preserve">[PENDING: give the repository or archive address that will be public]</w:t>
+      </w:r>
+      <w:r>
+        <w:rPr>
+          <w:rFonts w:ascii="Calibri" w:cs="Calibri" w:eastAsia="Microsoft YaHei" w:hAnsi="Calibri"/>
+        </w:rPr>
+        <w:t xml:space="preserve">.</w:t>
+      </w:r>
+    </w:p>
+    <w:p>
+      <w:pPr>
+        <w:pStyle w:val="Heading3"/>
+        <w:keepNext/>
+      </w:pPr>
+      <w:r>
+        <w:rPr>
+          <w:rFonts w:ascii="Calibri" w:cs="Calibri" w:eastAsia="Microsoft YaHei" w:hAnsi="Calibri"/>
+        </w:rPr>
+        <w:t xml:space="preserve">Selection of reports</w:t>
+      </w:r>
+    </w:p>
+    <w:p>
+      <w:pPr>
+        <w:spacing w:after="120"/>
+      </w:pPr>
+      <w:r>
+        <w:rPr>
+          <w:rFonts w:ascii="Calibri" w:cs="Calibri" w:eastAsia="Microsoft YaHei" w:hAnsi="Calibri"/>
+        </w:rPr>
+        <w:t xml:space="preserve">Titles and abstracts were screened in Rayyan by two reviewers independently (JS and FP) </w:t>
+      </w:r>
+      <w:r>
+        <w:rPr>
+          <w:rFonts w:ascii="Consolas" w:cs="Consolas" w:eastAsia="Microsoft YaHei" w:hAnsi="Consolas"/>
+          <w:sz w:val="19"/>
+          <w:szCs w:val="19"/>
+          <w:shd w:fill="EEEEEE" w:val="clear"/>
+        </w:rPr>
+        <w:t xml:space="preserve">[PENDING: do not keep "independently" for FP until her explanation is settled — see item 7 of section 1 of the note: according to the project log of 15 October, FP's decisions on most records were made with an AI coding agent]</w:t>
+      </w:r>
+      <w:r>
+        <w:rPr>
+          <w:rFonts w:ascii="Calibri" w:cs="Calibri" w:eastAsia="Microsoft YaHei" w:hAnsi="Calibri"/>
+        </w:rPr>
+        <w:t xml:space="preserve">, with Rayyan's blind mode on until both had finished the stage, author and journal details hidden, and Rayyan's artificial-intelligence functions, automatic duplicate detection and automatic duplicate resolution not used </w:t>
       </w:r>
       <w:r>
         <w:rPr>
@@ -7292,7 +7360,7 @@
         <w:sz w:val="17"/>
         <w:szCs w:val="17"/>
       </w:rPr>
-      <w:t xml:space="preserve">Methods draft and PRISMA-S appendix (draft) v2026-10-14a — PROSPERO CRD420261520329   |   第 </w:t>
+      <w:t xml:space="preserve">Methods draft and PRISMA-S appendix (draft) v2026-10-16a — PROSPERO CRD420261520329   |   第 </w:t>
     </w:r>
     <w:r>
       <w:rPr>

</xml_diff>